<commit_message>
Entrada definitiva: login principal, especificações e manual, protótipo (?demo)
- Página oficial (sem "?demo"): só o login das contas reais, sem usuários de
  demonstração. Até o banco de dados, avisa "em breve" e aponta o protótipo.
  Dois caminhos: "Especificações e manual" (portal/, a seguir) e "Abrir o protótipo".
- Protótipo em "?demo": a entrada de sempre (usuários de exemplo e Manual de
  teste), com a faixa "Protótipo · dados de exemplo" e a volta para a entrada oficial.
  O "?demo" acompanha a navegação; link do cliente e notificações o levam junto.
- Manual de teste (Word e página) aponta para o protótipo (?demo).
- Testes abrem o protótipo; tests/entrada.test.mjs (11) cobre a entrada oficial.
- Cache v40.

Co-Authored-By: Claude Opus 5.5 <noreply@anthropic.com>
Claude-Session: https://claude.ai/code/session_01Ep8bJsuQq2bqGePCMzzux2
</commit_message>
<xml_diff>
--- a/manual/KORbuild_Manual_de_teste.docx
+++ b/manual/KORbuild_Manual_de_teste.docx
@@ -45,7 +45,7 @@
           <w:rPr>
             <w:rStyle w:val="Hyperlink"/>
           </w:rPr>
-          <w:t>https://nardacci.github.io/KORbuildtech/</w:t>
+          <w:t>https://nardacci.github.io/KORbuildtech/?demo</w:t>
         </w:r>
       </w:hyperlink>
     </w:p>
@@ -1676,7 +1676,7 @@
           <w:rPr>
             <w:rStyle w:val="Hyperlink"/>
           </w:rPr>
-          <w:t>https://nardacci.github.io/KORbuildtech/</w:t>
+          <w:t>https://nardacci.github.io/KORbuildtech/?demo</w:t>
         </w:r>
       </w:hyperlink>
     </w:p>
@@ -6160,7 +6160,7 @@
           <w:rPr>
             <w:rStyle w:val="Hyperlink"/>
           </w:rPr>
-          <w:t>https://nardacci.github.io/KORbuildtech/</w:t>
+          <w:t>https://nardacci.github.io/KORbuildtech/?demo</w:t>
         </w:r>
       </w:hyperlink>
     </w:p>
@@ -8188,7 +8188,7 @@
           <w:rPr>
             <w:rStyle w:val="Hyperlink"/>
           </w:rPr>
-          <w:t>https://nardacci.github.io/KORbuildtech/</w:t>
+          <w:t>https://nardacci.github.io/KORbuildtech/?demo</w:t>
         </w:r>
       </w:hyperlink>
     </w:p>
@@ -9845,7 +9845,7 @@
           <w:rPr>
             <w:rStyle w:val="Hyperlink"/>
           </w:rPr>
-          <w:t>https://nardacci.github.io/KORbuildtech/</w:t>
+          <w:t>https://nardacci.github.io/KORbuildtech/?demo</w:t>
         </w:r>
       </w:hyperlink>
     </w:p>

</xml_diff>